<commit_message>
Remove Oboe+sordina & Bassoon+sordina — regenerate all CSVs (51 instruments, 185 registres, 1275 paires, 1173 convergences)
</commit_message>
<xml_diff>
--- a/Etude-Formants/Versions-html-and-docx/section_volume_v6.docx
+++ b/Etude-Formants/Versions-html-and-docx/section_volume_v6.docx
@@ -31,7 +31,7 @@
           <w:i w:val="0"/>
           <w:sz w:val="20"/>
         </w:rPr>
-        <w:t>Charles Koechlin, dans son Traité de l'orchestration (1954), a proposé un système d'attributs généraux du timbre — volume, intensité, transparence, densité — permettant de prédire quels mélanges sonneront fondus ou hétérogènes. Le volume selon Koechlin n'est pas l'intensité sonore, mais la place qu'un son semble occuper dans l'espace. Cette section opérationnalise ces concepts par l'analyse spectrale de 53 instruments (sourdines comprises), totalisant 5 835 échantillons sur 193 segments de registre.</w:t>
+        <w:t>Charles Koechlin, dans son Traité de l'orchestration (1954), a proposé un système d'attributs généraux du timbre — volume, intensité, transparence, densité — permettant de prédire quels mélanges sonneront fondus ou hétérogènes. Le volume selon Koechlin n'est pas l'intensité sonore, mais la place qu'un son semble occuper dans l'espace. Cette section opérationnalise ces concepts par l'analyse spectrale de 51 instruments (sourdines comprises), totalisant 5 758 échantillons sur 185 segments de registre.</w:t>
       </w:r>
     </w:p>
     <w:p>
@@ -313,7 +313,7 @@
                 <w:b/>
                 <w:sz w:val="14"/>
               </w:rPr>
-              <w:t>1.491</w:t>
+              <w:t>1.483</w:t>
             </w:r>
           </w:p>
         </w:tc>
@@ -331,7 +331,7 @@
                 <w:b w:val="0"/>
                 <w:sz w:val="14"/>
               </w:rPr>
-              <w:t>-1.491</w:t>
+              <w:t>-1.483</w:t>
             </w:r>
           </w:p>
         </w:tc>
@@ -423,7 +423,7 @@
                 <w:b/>
                 <w:sz w:val="14"/>
               </w:rPr>
-              <w:t>1.362</w:t>
+              <w:t>1.353</w:t>
             </w:r>
           </w:p>
         </w:tc>
@@ -441,7 +441,7 @@
                 <w:b w:val="0"/>
                 <w:sz w:val="14"/>
               </w:rPr>
-              <w:t>-1.362</w:t>
+              <w:t>-1.353</w:t>
             </w:r>
           </w:p>
         </w:tc>
@@ -533,7 +533,7 @@
                 <w:b/>
                 <w:sz w:val="14"/>
               </w:rPr>
-              <w:t>1.322</w:t>
+              <w:t>1.314</w:t>
             </w:r>
           </w:p>
         </w:tc>
@@ -551,7 +551,7 @@
                 <w:b w:val="0"/>
                 <w:sz w:val="14"/>
               </w:rPr>
-              <w:t>-1.322</w:t>
+              <w:t>-1.314</w:t>
             </w:r>
           </w:p>
         </w:tc>
@@ -643,7 +643,7 @@
                 <w:b/>
                 <w:sz w:val="14"/>
               </w:rPr>
-              <w:t>1.227</w:t>
+              <w:t>1.220</w:t>
             </w:r>
           </w:p>
         </w:tc>
@@ -661,7 +661,7 @@
                 <w:b w:val="0"/>
                 <w:sz w:val="14"/>
               </w:rPr>
-              <w:t>-1.227</w:t>
+              <w:t>-1.220</w:t>
             </w:r>
           </w:p>
         </w:tc>
@@ -753,7 +753,7 @@
                 <w:b/>
                 <w:sz w:val="14"/>
               </w:rPr>
-              <w:t>1.222</w:t>
+              <w:t>1.216</w:t>
             </w:r>
           </w:p>
         </w:tc>
@@ -771,7 +771,7 @@
                 <w:b w:val="0"/>
                 <w:sz w:val="14"/>
               </w:rPr>
-              <w:t>-1.222</w:t>
+              <w:t>-1.216</w:t>
             </w:r>
           </w:p>
         </w:tc>
@@ -863,7 +863,7 @@
                 <w:b/>
                 <w:sz w:val="14"/>
               </w:rPr>
-              <w:t>1.221</w:t>
+              <w:t>1.216</w:t>
             </w:r>
           </w:p>
         </w:tc>
@@ -881,7 +881,7 @@
                 <w:b w:val="0"/>
                 <w:sz w:val="14"/>
               </w:rPr>
-              <w:t>-1.221</w:t>
+              <w:t>-1.216</w:t>
             </w:r>
           </w:p>
         </w:tc>
@@ -973,7 +973,7 @@
                 <w:b/>
                 <w:sz w:val="14"/>
               </w:rPr>
-              <w:t>1.215</w:t>
+              <w:t>1.208</w:t>
             </w:r>
           </w:p>
         </w:tc>
@@ -991,7 +991,7 @@
                 <w:b w:val="0"/>
                 <w:sz w:val="14"/>
               </w:rPr>
-              <w:t>-1.215</w:t>
+              <w:t>-1.208</w:t>
             </w:r>
           </w:p>
         </w:tc>
@@ -1083,7 +1083,7 @@
                 <w:b/>
                 <w:sz w:val="14"/>
               </w:rPr>
-              <w:t>1.190</w:t>
+              <w:t>1.182</w:t>
             </w:r>
           </w:p>
         </w:tc>
@@ -1101,7 +1101,7 @@
                 <w:b w:val="0"/>
                 <w:sz w:val="14"/>
               </w:rPr>
-              <w:t>-1.190</w:t>
+              <w:t>-1.182</w:t>
             </w:r>
           </w:p>
         </w:tc>
@@ -1193,7 +1193,7 @@
                 <w:b/>
                 <w:sz w:val="14"/>
               </w:rPr>
-              <w:t>1.187</w:t>
+              <w:t>1.181</w:t>
             </w:r>
           </w:p>
         </w:tc>
@@ -1211,7 +1211,7 @@
                 <w:b w:val="0"/>
                 <w:sz w:val="14"/>
               </w:rPr>
-              <w:t>-1.187</w:t>
+              <w:t>-1.181</w:t>
             </w:r>
           </w:p>
         </w:tc>
@@ -1303,7 +1303,7 @@
                 <w:b/>
                 <w:sz w:val="14"/>
               </w:rPr>
-              <w:t>1.179</w:t>
+              <w:t>1.173</w:t>
             </w:r>
           </w:p>
         </w:tc>
@@ -1321,7 +1321,7 @@
                 <w:b w:val="0"/>
                 <w:sz w:val="14"/>
               </w:rPr>
-              <w:t>-1.179</w:t>
+              <w:t>-1.173</w:t>
             </w:r>
           </w:p>
         </w:tc>
@@ -1413,7 +1413,7 @@
                 <w:b/>
                 <w:sz w:val="14"/>
               </w:rPr>
-              <w:t>1.174</w:t>
+              <w:t>1.168</w:t>
             </w:r>
           </w:p>
         </w:tc>
@@ -1431,7 +1431,7 @@
                 <w:b w:val="0"/>
                 <w:sz w:val="14"/>
               </w:rPr>
-              <w:t>-1.174</w:t>
+              <w:t>-1.168</w:t>
             </w:r>
           </w:p>
         </w:tc>
@@ -1523,7 +1523,7 @@
                 <w:b/>
                 <w:sz w:val="14"/>
               </w:rPr>
-              <w:t>1.159</w:t>
+              <w:t>1.152</w:t>
             </w:r>
           </w:p>
         </w:tc>
@@ -1541,7 +1541,7 @@
                 <w:b w:val="0"/>
                 <w:sz w:val="14"/>
               </w:rPr>
-              <w:t>-1.159</w:t>
+              <w:t>-1.152</w:t>
             </w:r>
           </w:p>
         </w:tc>
@@ -1633,7 +1633,7 @@
                 <w:b/>
                 <w:sz w:val="14"/>
               </w:rPr>
-              <w:t>1.146</w:t>
+              <w:t>1.141</w:t>
             </w:r>
           </w:p>
         </w:tc>
@@ -1651,7 +1651,7 @@
                 <w:b w:val="0"/>
                 <w:sz w:val="14"/>
               </w:rPr>
-              <w:t>-1.146</w:t>
+              <w:t>-1.141</w:t>
             </w:r>
           </w:p>
         </w:tc>
@@ -1743,7 +1743,7 @@
                 <w:b/>
                 <w:sz w:val="14"/>
               </w:rPr>
-              <w:t>1.141</w:t>
+              <w:t>1.134</w:t>
             </w:r>
           </w:p>
         </w:tc>
@@ -1761,7 +1761,7 @@
                 <w:b w:val="0"/>
                 <w:sz w:val="14"/>
               </w:rPr>
-              <w:t>-1.141</w:t>
+              <w:t>-1.134</w:t>
             </w:r>
           </w:p>
         </w:tc>
@@ -1853,7 +1853,7 @@
                 <w:b/>
                 <w:sz w:val="14"/>
               </w:rPr>
-              <w:t>1.126</w:t>
+              <w:t>1.120</w:t>
             </w:r>
           </w:p>
         </w:tc>
@@ -1871,7 +1871,7 @@
                 <w:b w:val="0"/>
                 <w:sz w:val="14"/>
               </w:rPr>
-              <w:t>-1.126</w:t>
+              <w:t>-1.120</w:t>
             </w:r>
           </w:p>
         </w:tc>
@@ -1963,7 +1963,7 @@
                 <w:b/>
                 <w:sz w:val="14"/>
               </w:rPr>
-              <w:t>1.077</w:t>
+              <w:t>1.069</w:t>
             </w:r>
           </w:p>
         </w:tc>
@@ -1981,7 +1981,7 @@
                 <w:b w:val="0"/>
                 <w:sz w:val="14"/>
               </w:rPr>
-              <w:t>-1.077</w:t>
+              <w:t>-1.069</w:t>
             </w:r>
           </w:p>
         </w:tc>
@@ -2073,7 +2073,7 @@
                 <w:b/>
                 <w:sz w:val="14"/>
               </w:rPr>
-              <w:t>1.072</w:t>
+              <w:t>1.066</w:t>
             </w:r>
           </w:p>
         </w:tc>
@@ -2091,7 +2091,7 @@
                 <w:b w:val="0"/>
                 <w:sz w:val="14"/>
               </w:rPr>
-              <w:t>-1.072</w:t>
+              <w:t>-1.066</w:t>
             </w:r>
           </w:p>
         </w:tc>
@@ -2183,7 +2183,7 @@
                 <w:b/>
                 <w:sz w:val="14"/>
               </w:rPr>
-              <w:t>1.044</w:t>
+              <w:t>1.038</w:t>
             </w:r>
           </w:p>
         </w:tc>
@@ -2201,7 +2201,7 @@
                 <w:b w:val="0"/>
                 <w:sz w:val="14"/>
               </w:rPr>
-              <w:t>-1.044</w:t>
+              <w:t>-1.038</w:t>
             </w:r>
           </w:p>
         </w:tc>
@@ -2293,7 +2293,7 @@
                 <w:b/>
                 <w:sz w:val="14"/>
               </w:rPr>
-              <w:t>1.037</w:t>
+              <w:t>1.035</w:t>
             </w:r>
           </w:p>
         </w:tc>
@@ -2311,7 +2311,7 @@
                 <w:b w:val="0"/>
                 <w:sz w:val="14"/>
               </w:rPr>
-              <w:t>-1.037</w:t>
+              <w:t>-1.035</w:t>
             </w:r>
           </w:p>
         </w:tc>
@@ -2403,7 +2403,7 @@
                 <w:b/>
                 <w:sz w:val="14"/>
               </w:rPr>
-              <w:t>1.026</w:t>
+              <w:t>1.021</w:t>
             </w:r>
           </w:p>
         </w:tc>
@@ -2421,7 +2421,7 @@
                 <w:b w:val="0"/>
                 <w:sz w:val="14"/>
               </w:rPr>
-              <w:t>-1.026</w:t>
+              <w:t>-1.021</w:t>
             </w:r>
           </w:p>
         </w:tc>
@@ -2513,7 +2513,7 @@
                 <w:b/>
                 <w:sz w:val="14"/>
               </w:rPr>
-              <w:t>1.023</w:t>
+              <w:t>1.017</w:t>
             </w:r>
           </w:p>
         </w:tc>
@@ -2531,7 +2531,7 @@
                 <w:b w:val="0"/>
                 <w:sz w:val="14"/>
               </w:rPr>
-              <w:t>-1.023</w:t>
+              <w:t>-1.017</w:t>
             </w:r>
           </w:p>
         </w:tc>
@@ -2623,7 +2623,7 @@
                 <w:b/>
                 <w:sz w:val="14"/>
               </w:rPr>
-              <w:t>1.018</w:t>
+              <w:t>1.016</w:t>
             </w:r>
           </w:p>
         </w:tc>
@@ -2641,7 +2641,7 @@
                 <w:b w:val="0"/>
                 <w:sz w:val="14"/>
               </w:rPr>
-              <w:t>-1.018</w:t>
+              <w:t>-1.016</w:t>
             </w:r>
           </w:p>
         </w:tc>
@@ -2733,7 +2733,7 @@
                 <w:b/>
                 <w:sz w:val="14"/>
               </w:rPr>
-              <w:t>1.018</w:t>
+              <w:t>1.015</w:t>
             </w:r>
           </w:p>
         </w:tc>
@@ -2751,7 +2751,7 @@
                 <w:b w:val="0"/>
                 <w:sz w:val="14"/>
               </w:rPr>
-              <w:t>-1.018</w:t>
+              <w:t>-1.015</w:t>
             </w:r>
           </w:p>
         </w:tc>
@@ -2843,7 +2843,7 @@
                 <w:b/>
                 <w:sz w:val="14"/>
               </w:rPr>
-              <w:t>1.015</w:t>
+              <w:t>1.012</w:t>
             </w:r>
           </w:p>
         </w:tc>
@@ -2861,7 +2861,7 @@
                 <w:b w:val="0"/>
                 <w:sz w:val="14"/>
               </w:rPr>
-              <w:t>-1.015</w:t>
+              <w:t>-1.012</w:t>
             </w:r>
           </w:p>
         </w:tc>
@@ -2953,7 +2953,7 @@
                 <w:b/>
                 <w:sz w:val="14"/>
               </w:rPr>
-              <w:t>1.008</w:t>
+              <w:t>1.002</w:t>
             </w:r>
           </w:p>
         </w:tc>
@@ -2971,7 +2971,7 @@
                 <w:b w:val="0"/>
                 <w:sz w:val="14"/>
               </w:rPr>
-              <w:t>-1.008</w:t>
+              <w:t>-1.002</w:t>
             </w:r>
           </w:p>
         </w:tc>
@@ -2985,7 +2985,7 @@
           <w:color w:val="808080"/>
           <w:sz w:val="16"/>
         </w:rPr>
-        <w:t>(Tableau complet : 193 entrées dans le fichier CSV et la version HTML en ligne.)</w:t>
+        <w:t>(Tableau complet : 185 entrées dans le fichier CSV et la version HTML en ligne.)</w:t>
       </w:r>
     </w:p>
     <w:p>
@@ -3365,7 +3365,7 @@
           <w:i w:val="0"/>
           <w:sz w:val="20"/>
         </w:rPr>
-        <w:t>1 378 paires analysées (53 instruments × registre médium) :</w:t>
+        <w:t>1 275 paires analysées (53 instruments × registre médium) :</w:t>
       </w:r>
     </w:p>
     <w:p>
@@ -3385,7 +3385,7 @@
           <w:i w:val="0"/>
           <w:sz w:val="18"/>
         </w:rPr>
-        <w:t xml:space="preserve">  • 148 paires FONDU</w:t>
+        <w:t xml:space="preserve">  • 146 paires FONDU</w:t>
       </w:r>
     </w:p>
     <w:p>
@@ -3395,7 +3395,7 @@
           <w:i w:val="0"/>
           <w:sz w:val="18"/>
         </w:rPr>
-        <w:t xml:space="preserve">  • 160 paires FONDU_Fp</w:t>
+        <w:t xml:space="preserve">  • 145 paires FONDU_Fp</w:t>
       </w:r>
     </w:p>
     <w:p>
@@ -3405,7 +3405,7 @@
           <w:i w:val="0"/>
           <w:sz w:val="18"/>
         </w:rPr>
-        <w:t xml:space="preserve">  • 476 paires HÉTÉROGÈNE</w:t>
+        <w:t xml:space="preserve">  • 427 paires HÉTÉROGÈNE</w:t>
       </w:r>
     </w:p>
     <w:p>
@@ -3415,7 +3415,7 @@
           <w:i w:val="0"/>
           <w:sz w:val="18"/>
         </w:rPr>
-        <w:t xml:space="preserve">  • 95 paires SEMI-FONDU</w:t>
+        <w:t xml:space="preserve">  • 94 paires SEMI-FONDU</w:t>
       </w:r>
     </w:p>
     <w:p>
@@ -3425,7 +3425,7 @@
           <w:i w:val="0"/>
           <w:sz w:val="18"/>
         </w:rPr>
-        <w:t xml:space="preserve">  • 488 paires SEMI-FONDU_H</w:t>
+        <w:t xml:space="preserve">  • 452 paires SEMI-FONDU_H</w:t>
       </w:r>
     </w:p>
     <w:p>
@@ -3446,7 +3446,7 @@
           <w:i w:val="0"/>
           <w:sz w:val="20"/>
         </w:rPr>
-        <w:t>1 220 convergences (ΔF₁ ≤ 30 Hz) réparties en 5 zones : /u/ (544, fondation), /o/ (423, cluster central), /å/ (125, transition), /a/ (54, projection), /e/–/i/ (74, brillance/sourdines). 79 % des convergences se situent dans /u/ et /o/ (F₁ ≤ 400 Hz).</w:t>
+        <w:t>1 173 convergences (ΔF₁ ≤ 30 Hz) réparties en 5 zones : /u/ (544, fondation), /o/ (423, cluster central), /å/ (103, transition), /a/ (41, projection), /e/–/i/ (62, brillance/sourdines). 79 % des convergences se situent dans /u/ et /o/ (F₁ ≤ 400 Hz).</w:t>
       </w:r>
     </w:p>
     <w:p>

</xml_diff>